<commit_message>
Rep systm rework progress
</commit_message>
<xml_diff>
--- a/QuestBook.docx
+++ b/QuestBook.docx
@@ -1078,6 +1078,7 @@
       <w:r>
         <w:rPr>
           <w:rFonts w:ascii="Times New Roman" w:eastAsia="Times New Roman" w:hAnsi="Times New Roman" w:cs="Times New Roman"/>
+          <w:noProof/>
           <w:sz w:val="36"/>
           <w:szCs w:val="36"/>
         </w:rPr>
@@ -1164,6 +1165,36 @@
     </w:p>
     <w:p>
       <w:pPr>
+        <w:jc w:val="both"/>
+        <w:rPr>
+          <w:rFonts w:ascii="Times New Roman" w:eastAsia="Times New Roman" w:hAnsi="Times New Roman" w:cs="Times New Roman"/>
+          <w:sz w:val="20"/>
+          <w:szCs w:val="20"/>
+        </w:rPr>
+      </w:pPr>
+      <w:r>
+        <w:rPr>
+          <w:rFonts w:ascii="Times New Roman" w:eastAsia="Times New Roman" w:hAnsi="Times New Roman" w:cs="Times New Roman"/>
+          <w:sz w:val="20"/>
+          <w:szCs w:val="20"/>
+        </w:rPr>
+        <w:t>Rendszerkövetelmények:</w:t>
+      </w:r>
+      <w:bookmarkStart w:id="2" w:name="_GoBack"/>
+      <w:bookmarkEnd w:id="2"/>
+    </w:p>
+    <w:p>
+      <w:pPr>
+        <w:jc w:val="both"/>
+        <w:rPr>
+          <w:rFonts w:ascii="Times New Roman" w:eastAsia="Times New Roman" w:hAnsi="Times New Roman" w:cs="Times New Roman"/>
+          <w:sz w:val="20"/>
+          <w:szCs w:val="20"/>
+        </w:rPr>
+      </w:pPr>
+    </w:p>
+    <w:p>
+      <w:pPr>
         <w:rPr>
           <w:rFonts w:ascii="Times New Roman" w:eastAsia="Times New Roman" w:hAnsi="Times New Roman" w:cs="Times New Roman"/>
           <w:sz w:val="28"/>
@@ -1397,6 +1428,7 @@
           <w:sz w:val="24"/>
           <w:szCs w:val="24"/>
         </w:rPr>
+        <w:lastRenderedPageBreak/>
         <w:t>2.</w:t>
       </w:r>
       <w:r>
@@ -1471,7 +1503,6 @@
           <w:sz w:val="24"/>
           <w:szCs w:val="24"/>
         </w:rPr>
-        <w:lastRenderedPageBreak/>
         <w:t xml:space="preserve">A weboldal </w:t>
       </w:r>
       <w:r>
@@ -1578,8 +1609,6 @@
         </w:rPr>
         <w:t>UserData:</w:t>
       </w:r>
-      <w:bookmarkStart w:id="2" w:name="_GoBack"/>
-      <w:bookmarkEnd w:id="2"/>
     </w:p>
     <w:p>
       <w:pPr>

</xml_diff>